<commit_message>
maj travaux de vac
</commit_message>
<xml_diff>
--- a/examens/1/travail_de_vacances/1 - CORRECTIF_travail de vacances sans solides.docx
+++ b/examens/1/travail_de_vacances/1 - CORRECTIF_travail de vacances sans solides.docx
@@ -1,6 +1,6 @@
 
 <file path=word/document.xml><?xml version="1.0" encoding="utf-8"?>
-<w:document xmlns:wpc="http://schemas.microsoft.com/office/word/2010/wordprocessingCanvas" xmlns:cx="http://schemas.microsoft.com/office/drawing/2014/chartex" xmlns:cx1="http://schemas.microsoft.com/office/drawing/2015/9/8/chartex" xmlns:cx2="http://schemas.microsoft.com/office/drawing/2015/10/21/chartex" xmlns:cx3="http://schemas.microsoft.com/office/drawing/2016/5/9/chartex" xmlns:cx4="http://schemas.microsoft.com/office/drawing/2016/5/10/chartex" xmlns:cx5="http://schemas.microsoft.com/office/drawing/2016/5/11/chartex" xmlns:cx6="http://schemas.microsoft.com/office/drawing/2016/5/12/chartex" xmlns:cx7="http://schemas.microsoft.com/office/drawing/2016/5/13/chartex" xmlns:cx8="http://schemas.microsoft.com/office/drawing/2016/5/14/chartex" xmlns:mc="http://schemas.openxmlformats.org/markup-compatibility/2006" xmlns:aink="http://schemas.microsoft.com/office/drawing/2016/ink" xmlns:am3d="http://schemas.microsoft.com/office/drawing/2017/model3d" xmlns:o="urn:schemas-microsoft-com:office:office" xmlns:oel="http://schemas.microsoft.com/office/2019/extlst" xmlns:r="http://schemas.openxmlformats.org/officeDocument/2006/relationships" xmlns:m="http://schemas.openxmlformats.org/officeDocument/2006/math" xmlns:v="urn:schemas-microsoft-com:vml" xmlns:wp14="http://schemas.microsoft.com/office/word/2010/wordprocessingDrawing" xmlns:wp="http://schemas.openxmlformats.org/drawingml/2006/wordprocessingDrawing" xmlns:w10="urn:schemas-microsoft-com:office:word" xmlns:w="http://schemas.openxmlformats.org/wordprocessingml/2006/main" xmlns:w14="http://schemas.microsoft.com/office/word/2010/wordml" xmlns:w15="http://schemas.microsoft.com/office/word/2012/wordml" xmlns:w16cex="http://schemas.microsoft.com/office/word/2018/wordml/cex" xmlns:w16cid="http://schemas.microsoft.com/office/word/2016/wordml/cid" xmlns:w16="http://schemas.microsoft.com/office/word/2018/wordml" xmlns:w16sdtdh="http://schemas.microsoft.com/office/word/2020/wordml/sdtdatahash" xmlns:w16se="http://schemas.microsoft.com/office/word/2015/wordml/symex" xmlns:wpg="http://schemas.microsoft.com/office/word/2010/wordprocessingGroup" xmlns:wpi="http://schemas.microsoft.com/office/word/2010/wordprocessingInk" xmlns:wne="http://schemas.microsoft.com/office/word/2006/wordml" xmlns:wps="http://schemas.microsoft.com/office/word/2010/wordprocessingShape" mc:Ignorable="w14 w15 w16se w16cid w16 w16cex w16sdtdh wp14">
+<w:document xmlns:wpc="http://schemas.microsoft.com/office/word/2010/wordprocessingCanvas" xmlns:cx="http://schemas.microsoft.com/office/drawing/2014/chartex" xmlns:cx1="http://schemas.microsoft.com/office/drawing/2015/9/8/chartex" xmlns:cx2="http://schemas.microsoft.com/office/drawing/2015/10/21/chartex" xmlns:cx3="http://schemas.microsoft.com/office/drawing/2016/5/9/chartex" xmlns:cx4="http://schemas.microsoft.com/office/drawing/2016/5/10/chartex" xmlns:cx5="http://schemas.microsoft.com/office/drawing/2016/5/11/chartex" xmlns:cx6="http://schemas.microsoft.com/office/drawing/2016/5/12/chartex" xmlns:cx7="http://schemas.microsoft.com/office/drawing/2016/5/13/chartex" xmlns:cx8="http://schemas.microsoft.com/office/drawing/2016/5/14/chartex" xmlns:mc="http://schemas.openxmlformats.org/markup-compatibility/2006" xmlns:aink="http://schemas.microsoft.com/office/drawing/2016/ink" xmlns:am3d="http://schemas.microsoft.com/office/drawing/2017/model3d" xmlns:o="urn:schemas-microsoft-com:office:office" xmlns:oel="http://schemas.microsoft.com/office/2019/extlst" xmlns:r="http://schemas.openxmlformats.org/officeDocument/2006/relationships" xmlns:m="http://schemas.openxmlformats.org/officeDocument/2006/math" xmlns:v="urn:schemas-microsoft-com:vml" xmlns:wp14="http://schemas.microsoft.com/office/word/2010/wordprocessingDrawing" xmlns:wp="http://schemas.openxmlformats.org/drawingml/2006/wordprocessingDrawing" xmlns:w10="urn:schemas-microsoft-com:office:word" xmlns:w="http://schemas.openxmlformats.org/wordprocessingml/2006/main" xmlns:w14="http://schemas.microsoft.com/office/word/2010/wordml" xmlns:w15="http://schemas.microsoft.com/office/word/2012/wordml" xmlns:w16cex="http://schemas.microsoft.com/office/word/2018/wordml/cex" xmlns:w16cid="http://schemas.microsoft.com/office/word/2016/wordml/cid" xmlns:w16="http://schemas.microsoft.com/office/word/2018/wordml" xmlns:w16du="http://schemas.microsoft.com/office/word/2023/wordml/word16du" xmlns:w16sdtdh="http://schemas.microsoft.com/office/word/2020/wordml/sdtdatahash" xmlns:w16se="http://schemas.microsoft.com/office/word/2015/wordml/symex" xmlns:wpg="http://schemas.microsoft.com/office/word/2010/wordprocessingGroup" xmlns:wpi="http://schemas.microsoft.com/office/word/2010/wordprocessingInk" xmlns:wne="http://schemas.microsoft.com/office/word/2006/wordml" xmlns:wps="http://schemas.microsoft.com/office/word/2010/wordprocessingShape" mc:Ignorable="w14 w15 w16se w16cid w16 w16cex w16sdtdh w16du wp14">
   <w:body>
     <w:p>
       <w:r>
@@ -314,18 +314,6 @@
             <w:pPr>
               <w:spacing w:before="120" w:after="120"/>
             </w:pPr>
-            <w:r>
-              <w:rPr>
-                <w:rFonts w:ascii="Trebuchet MS" w:hAnsi="Trebuchet MS"/>
-              </w:rPr>
-              <w:t xml:space="preserve">Année : </w:t>
-            </w:r>
-            <w:r>
-              <w:rPr>
-                <w:rFonts w:ascii="Trebuchet MS" w:hAnsi="Trebuchet MS"/>
-              </w:rPr>
-              <w:t>2022 - 2023</w:t>
-            </w:r>
           </w:p>
         </w:tc>
         <w:tc>
@@ -479,10 +467,7 @@
         <w:pStyle w:val="Titre4"/>
       </w:pPr>
       <w:r>
-        <w:t xml:space="preserve">Exercice </w:t>
-      </w:r>
-      <w:r>
-        <w:t>2</w:t>
+        <w:t>Exercice 2</w:t>
       </w:r>
     </w:p>
     <w:p>
@@ -545,10 +530,7 @@
         <w:pStyle w:val="Titre4"/>
       </w:pPr>
       <w:r>
-        <w:t xml:space="preserve">Exercice </w:t>
-      </w:r>
-      <w:r>
-        <w:t>3</w:t>
+        <w:t>Exercice 3</w:t>
       </w:r>
     </w:p>
     <w:tbl>
@@ -1817,10 +1799,7 @@
         <w:pStyle w:val="Titre4"/>
       </w:pPr>
       <w:r>
-        <w:t xml:space="preserve">Exercice </w:t>
-      </w:r>
-      <w:r>
-        <w:t>4</w:t>
+        <w:t>Exercice 4</w:t>
       </w:r>
     </w:p>
     <w:p>
@@ -1950,10 +1929,7 @@
         </w:sectPr>
       </w:pPr>
       <w:r>
-        <w:t xml:space="preserve">Exercice </w:t>
-      </w:r>
-      <w:r>
-        <w:t>5</w:t>
+        <w:t>Exercice 5</w:t>
       </w:r>
     </w:p>
     <w:p>
@@ -2220,10 +2196,7 @@
         <w:spacing w:before="360"/>
       </w:pPr>
       <w:r>
-        <w:t xml:space="preserve">Exercice </w:t>
-      </w:r>
-      <w:r>
-        <w:t>6</w:t>
+        <w:t>Exercice 6</w:t>
       </w:r>
     </w:p>
     <w:tbl>
@@ -3192,10 +3165,7 @@
       </w:pPr>
       <w:r>
         <w:lastRenderedPageBreak/>
-        <w:t xml:space="preserve">Exercice </w:t>
-      </w:r>
-      <w:r>
-        <w:t>7</w:t>
+        <w:t>Exercice 7</w:t>
       </w:r>
     </w:p>
     <w:p>
@@ -3688,10 +3658,7 @@
         <w:pStyle w:val="Titre4"/>
       </w:pPr>
       <w:r>
-        <w:t xml:space="preserve">Exercice </w:t>
-      </w:r>
-      <w:r>
-        <w:t>8</w:t>
+        <w:t>Exercice 8</w:t>
       </w:r>
     </w:p>
     <w:p>
@@ -3789,10 +3756,7 @@
         <w:pStyle w:val="Titre4"/>
       </w:pPr>
       <w:r>
-        <w:t xml:space="preserve">Exercice </w:t>
-      </w:r>
-      <w:r>
-        <w:t>9</w:t>
+        <w:t>Exercice 9</w:t>
       </w:r>
     </w:p>
     <w:p>
@@ -4111,10 +4075,7 @@
         <w:pStyle w:val="Titre4"/>
       </w:pPr>
       <w:r>
-        <w:t xml:space="preserve">Exercice </w:t>
-      </w:r>
-      <w:r>
-        <w:t>10</w:t>
+        <w:t>Exercice 10</w:t>
       </w:r>
     </w:p>
     <w:p>
@@ -4212,10 +4173,7 @@
         <w:pStyle w:val="Titre4"/>
       </w:pPr>
       <w:r>
-        <w:t xml:space="preserve">Exercice </w:t>
-      </w:r>
-      <w:r>
-        <w:t>11</w:t>
+        <w:t>Exercice 11</w:t>
       </w:r>
     </w:p>
     <w:p>
@@ -4354,10 +4312,7 @@
         <w:pStyle w:val="Titre4"/>
       </w:pPr>
       <w:r>
-        <w:t xml:space="preserve">Exercice </w:t>
-      </w:r>
-      <w:r>
-        <w:t>12</w:t>
+        <w:t>Exercice 12</w:t>
       </w:r>
     </w:p>
     <w:p>
@@ -4447,10 +4402,7 @@
       </w:pPr>
       <w:r>
         <w:lastRenderedPageBreak/>
-        <w:t xml:space="preserve">Exercice </w:t>
-      </w:r>
-      <w:r>
-        <w:t>13</w:t>
+        <w:t>Exercice 13</w:t>
       </w:r>
     </w:p>
     <w:p>
@@ -5038,10 +4990,7 @@
         <w:pStyle w:val="Titre4"/>
       </w:pPr>
       <w:r>
-        <w:t xml:space="preserve">Exercice </w:t>
-      </w:r>
-      <w:r>
-        <w:t>14</w:t>
+        <w:t>Exercice 14</w:t>
       </w:r>
     </w:p>
     <w:p>
@@ -5472,10 +5421,7 @@
         </w:sectPr>
       </w:pPr>
       <w:r>
-        <w:t xml:space="preserve">Exercice </w:t>
-      </w:r>
-      <w:r>
-        <w:t>15</w:t>
+        <w:t>Exercice 15</w:t>
       </w:r>
     </w:p>
     <w:p>
@@ -5584,10 +5530,7 @@
         <w:pStyle w:val="Titre4"/>
       </w:pPr>
       <w:r>
-        <w:t xml:space="preserve">Exercice </w:t>
-      </w:r>
-      <w:r>
-        <w:t>16</w:t>
+        <w:t>Exercice 16</w:t>
       </w:r>
     </w:p>
     <w:p>
@@ -5818,10 +5761,7 @@
         </w:sectPr>
       </w:pPr>
       <w:r>
-        <w:t xml:space="preserve">Exercice </w:t>
-      </w:r>
-      <w:r>
-        <w:t>17</w:t>
+        <w:t>Exercice 17</w:t>
       </w:r>
     </w:p>
     <w:p>
@@ -6215,10 +6155,7 @@
         </w:sectPr>
       </w:pPr>
       <w:r>
-        <w:t xml:space="preserve">Exercice </w:t>
-      </w:r>
-      <w:r>
-        <w:t>18</w:t>
+        <w:t>Exercice 18</w:t>
       </w:r>
     </w:p>
     <w:p>
@@ -6550,10 +6487,7 @@
         </w:sectPr>
       </w:pPr>
       <w:r>
-        <w:t>Exercice 1</w:t>
-      </w:r>
-      <w:r>
-        <w:t>9</w:t>
+        <w:t>Exercice 19</w:t>
       </w:r>
     </w:p>
     <w:p>
@@ -6658,10 +6592,7 @@
         </w:sectPr>
       </w:pPr>
       <w:r>
-        <w:t xml:space="preserve">Exercice </w:t>
-      </w:r>
-      <w:r>
-        <w:t>20</w:t>
+        <w:t>Exercice 20</w:t>
       </w:r>
     </w:p>
     <w:p>
@@ -7248,10 +7179,7 @@
         <w:pStyle w:val="Titre4"/>
       </w:pPr>
       <w:r>
-        <w:t xml:space="preserve">Exercice </w:t>
-      </w:r>
-      <w:r>
-        <w:t>22</w:t>
+        <w:t>Exercice 22</w:t>
       </w:r>
     </w:p>
     <w:p>
@@ -7355,10 +7283,7 @@
         <w:pStyle w:val="Titre4"/>
       </w:pPr>
       <w:r>
-        <w:t xml:space="preserve">Exercice </w:t>
-      </w:r>
-      <w:r>
-        <w:t>23</w:t>
+        <w:t>Exercice 23</w:t>
       </w:r>
     </w:p>
     <w:p>
@@ -7719,10 +7644,7 @@
         <w:pStyle w:val="Titre4"/>
       </w:pPr>
       <w:r>
-        <w:t xml:space="preserve">Exercice </w:t>
-      </w:r>
-      <w:r>
-        <w:t>25</w:t>
+        <w:t>Exercice 25</w:t>
       </w:r>
     </w:p>
     <w:tbl>
@@ -8265,10 +8187,7 @@
         <w:pStyle w:val="Titre4"/>
       </w:pPr>
       <w:r>
-        <w:t xml:space="preserve">Exercice </w:t>
-      </w:r>
-      <w:r>
-        <w:t>26</w:t>
+        <w:t>Exercice 26</w:t>
       </w:r>
     </w:p>
     <w:p>
@@ -8454,10 +8373,7 @@
         <w:pStyle w:val="Titre4"/>
       </w:pPr>
       <w:r>
-        <w:t xml:space="preserve">Exercice </w:t>
-      </w:r>
-      <w:r>
-        <w:t>27</w:t>
+        <w:t>Exercice 27</w:t>
       </w:r>
     </w:p>
     <w:p>
@@ -8828,10 +8744,7 @@
       </w:pPr>
       <w:r>
         <w:lastRenderedPageBreak/>
-        <w:t xml:space="preserve">Exercice </w:t>
-      </w:r>
-      <w:r>
-        <w:t>28</w:t>
+        <w:t>Exercice 28</w:t>
       </w:r>
     </w:p>
     <w:p>
@@ -8897,10 +8810,7 @@
         <w:pStyle w:val="Titre4"/>
       </w:pPr>
       <w:r>
-        <w:t xml:space="preserve">Exercice </w:t>
-      </w:r>
-      <w:r>
-        <w:t>29</w:t>
+        <w:t>Exercice 29</w:t>
       </w:r>
     </w:p>
     <w:p>
@@ -9052,10 +8962,7 @@
         </w:sectPr>
       </w:pPr>
       <w:r>
-        <w:t xml:space="preserve">Exercice </w:t>
-      </w:r>
-      <w:r>
-        <w:t>30</w:t>
+        <w:t>Exercice 30</w:t>
       </w:r>
     </w:p>
     <w:p>
@@ -9251,10 +9158,7 @@
         <w:t xml:space="preserve"> </w:t>
       </w:r>
       <w:r>
-        <w:t xml:space="preserve">Exercice </w:t>
-      </w:r>
-      <w:r>
-        <w:t>31</w:t>
+        <w:t>Exercice 31</w:t>
       </w:r>
     </w:p>
     <w:p>
@@ -9641,10 +9545,7 @@
         <w:pStyle w:val="Titre4"/>
       </w:pPr>
       <w:r>
-        <w:t xml:space="preserve">Exercice </w:t>
-      </w:r>
-      <w:r>
-        <w:t>32</w:t>
+        <w:t>Exercice 32</w:t>
       </w:r>
     </w:p>
     <w:p>
@@ -9745,10 +9646,7 @@
         <w:pStyle w:val="Titre4"/>
       </w:pPr>
       <w:r>
-        <w:t xml:space="preserve">Exercice </w:t>
-      </w:r>
-      <w:r>
-        <w:t>33</w:t>
+        <w:t>Exercice 33</w:t>
       </w:r>
     </w:p>
     <w:p>
@@ -9941,10 +9839,7 @@
       </w:pPr>
       <w:r>
         <w:lastRenderedPageBreak/>
-        <w:t xml:space="preserve">Exercice </w:t>
-      </w:r>
-      <w:r>
-        <w:t>34</w:t>
+        <w:t>Exercice 34</w:t>
       </w:r>
     </w:p>
     <w:p>
@@ -10676,10 +10571,7 @@
         <w:pStyle w:val="Titre4"/>
       </w:pPr>
       <w:r>
-        <w:t xml:space="preserve">Exercice </w:t>
-      </w:r>
-      <w:r>
-        <w:t>35</w:t>
+        <w:t>Exercice 35</w:t>
       </w:r>
     </w:p>
     <w:p>
@@ -10891,10 +10783,7 @@
         <w:pStyle w:val="Titre4"/>
       </w:pPr>
       <w:r>
-        <w:t xml:space="preserve">Exercice </w:t>
-      </w:r>
-      <w:r>
-        <w:t>36</w:t>
+        <w:t>Exercice 36</w:t>
       </w:r>
     </w:p>
     <w:p>
@@ -10936,10 +10825,7 @@
         <w:pStyle w:val="Titre4"/>
       </w:pPr>
       <w:r>
-        <w:t xml:space="preserve">Exercice </w:t>
-      </w:r>
-      <w:r>
-        <w:t>37</w:t>
+        <w:t>Exercice 37</w:t>
       </w:r>
     </w:p>
     <w:p>
@@ -11279,7 +11165,7 @@
 </file>
 
 <file path=word/endnotes.xml><?xml version="1.0" encoding="utf-8"?>
-<w:endnotes xmlns:wpc="http://schemas.microsoft.com/office/word/2010/wordprocessingCanvas" xmlns:cx="http://schemas.microsoft.com/office/drawing/2014/chartex" xmlns:cx1="http://schemas.microsoft.com/office/drawing/2015/9/8/chartex" xmlns:cx2="http://schemas.microsoft.com/office/drawing/2015/10/21/chartex" xmlns:cx3="http://schemas.microsoft.com/office/drawing/2016/5/9/chartex" xmlns:cx4="http://schemas.microsoft.com/office/drawing/2016/5/10/chartex" xmlns:cx5="http://schemas.microsoft.com/office/drawing/2016/5/11/chartex" xmlns:cx6="http://schemas.microsoft.com/office/drawing/2016/5/12/chartex" xmlns:cx7="http://schemas.microsoft.com/office/drawing/2016/5/13/chartex" xmlns:cx8="http://schemas.microsoft.com/office/drawing/2016/5/14/chartex" xmlns:mc="http://schemas.openxmlformats.org/markup-compatibility/2006" xmlns:aink="http://schemas.microsoft.com/office/drawing/2016/ink" xmlns:am3d="http://schemas.microsoft.com/office/drawing/2017/model3d" xmlns:o="urn:schemas-microsoft-com:office:office" xmlns:oel="http://schemas.microsoft.com/office/2019/extlst" xmlns:r="http://schemas.openxmlformats.org/officeDocument/2006/relationships" xmlns:m="http://schemas.openxmlformats.org/officeDocument/2006/math" xmlns:v="urn:schemas-microsoft-com:vml" xmlns:wp14="http://schemas.microsoft.com/office/word/2010/wordprocessingDrawing" xmlns:wp="http://schemas.openxmlformats.org/drawingml/2006/wordprocessingDrawing" xmlns:w10="urn:schemas-microsoft-com:office:word" xmlns:w="http://schemas.openxmlformats.org/wordprocessingml/2006/main" xmlns:w14="http://schemas.microsoft.com/office/word/2010/wordml" xmlns:w15="http://schemas.microsoft.com/office/word/2012/wordml" xmlns:w16cex="http://schemas.microsoft.com/office/word/2018/wordml/cex" xmlns:w16cid="http://schemas.microsoft.com/office/word/2016/wordml/cid" xmlns:w16="http://schemas.microsoft.com/office/word/2018/wordml" xmlns:w16sdtdh="http://schemas.microsoft.com/office/word/2020/wordml/sdtdatahash" xmlns:w16se="http://schemas.microsoft.com/office/word/2015/wordml/symex" xmlns:wpg="http://schemas.microsoft.com/office/word/2010/wordprocessingGroup" xmlns:wpi="http://schemas.microsoft.com/office/word/2010/wordprocessingInk" xmlns:wne="http://schemas.microsoft.com/office/word/2006/wordml" xmlns:wps="http://schemas.microsoft.com/office/word/2010/wordprocessingShape" mc:Ignorable="w14 w15 w16se w16cid w16 w16cex w16sdtdh wp14">
+<w:endnotes xmlns:wpc="http://schemas.microsoft.com/office/word/2010/wordprocessingCanvas" xmlns:cx="http://schemas.microsoft.com/office/drawing/2014/chartex" xmlns:cx1="http://schemas.microsoft.com/office/drawing/2015/9/8/chartex" xmlns:cx2="http://schemas.microsoft.com/office/drawing/2015/10/21/chartex" xmlns:cx3="http://schemas.microsoft.com/office/drawing/2016/5/9/chartex" xmlns:cx4="http://schemas.microsoft.com/office/drawing/2016/5/10/chartex" xmlns:cx5="http://schemas.microsoft.com/office/drawing/2016/5/11/chartex" xmlns:cx6="http://schemas.microsoft.com/office/drawing/2016/5/12/chartex" xmlns:cx7="http://schemas.microsoft.com/office/drawing/2016/5/13/chartex" xmlns:cx8="http://schemas.microsoft.com/office/drawing/2016/5/14/chartex" xmlns:mc="http://schemas.openxmlformats.org/markup-compatibility/2006" xmlns:aink="http://schemas.microsoft.com/office/drawing/2016/ink" xmlns:am3d="http://schemas.microsoft.com/office/drawing/2017/model3d" xmlns:o="urn:schemas-microsoft-com:office:office" xmlns:oel="http://schemas.microsoft.com/office/2019/extlst" xmlns:r="http://schemas.openxmlformats.org/officeDocument/2006/relationships" xmlns:m="http://schemas.openxmlformats.org/officeDocument/2006/math" xmlns:v="urn:schemas-microsoft-com:vml" xmlns:wp14="http://schemas.microsoft.com/office/word/2010/wordprocessingDrawing" xmlns:wp="http://schemas.openxmlformats.org/drawingml/2006/wordprocessingDrawing" xmlns:w10="urn:schemas-microsoft-com:office:word" xmlns:w="http://schemas.openxmlformats.org/wordprocessingml/2006/main" xmlns:w14="http://schemas.microsoft.com/office/word/2010/wordml" xmlns:w15="http://schemas.microsoft.com/office/word/2012/wordml" xmlns:w16cex="http://schemas.microsoft.com/office/word/2018/wordml/cex" xmlns:w16cid="http://schemas.microsoft.com/office/word/2016/wordml/cid" xmlns:w16="http://schemas.microsoft.com/office/word/2018/wordml" xmlns:w16du="http://schemas.microsoft.com/office/word/2023/wordml/word16du" xmlns:w16sdtdh="http://schemas.microsoft.com/office/word/2020/wordml/sdtdatahash" xmlns:w16se="http://schemas.microsoft.com/office/word/2015/wordml/symex" xmlns:wpg="http://schemas.microsoft.com/office/word/2010/wordprocessingGroup" xmlns:wpi="http://schemas.microsoft.com/office/word/2010/wordprocessingInk" xmlns:wne="http://schemas.microsoft.com/office/word/2006/wordml" xmlns:wps="http://schemas.microsoft.com/office/word/2010/wordprocessingShape" mc:Ignorable="w14 w15 w16se w16cid w16 w16cex w16sdtdh w16du wp14">
   <w:endnote w:type="separator" w:id="-1">
     <w:p>
       <w:pPr>
@@ -11304,7 +11190,7 @@
 </file>
 
 <file path=word/footer1.xml><?xml version="1.0" encoding="utf-8"?>
-<w:ftr xmlns:wpc="http://schemas.microsoft.com/office/word/2010/wordprocessingCanvas" xmlns:cx="http://schemas.microsoft.com/office/drawing/2014/chartex" xmlns:cx1="http://schemas.microsoft.com/office/drawing/2015/9/8/chartex" xmlns:cx2="http://schemas.microsoft.com/office/drawing/2015/10/21/chartex" xmlns:cx3="http://schemas.microsoft.com/office/drawing/2016/5/9/chartex" xmlns:cx4="http://schemas.microsoft.com/office/drawing/2016/5/10/chartex" xmlns:cx5="http://schemas.microsoft.com/office/drawing/2016/5/11/chartex" xmlns:cx6="http://schemas.microsoft.com/office/drawing/2016/5/12/chartex" xmlns:cx7="http://schemas.microsoft.com/office/drawing/2016/5/13/chartex" xmlns:cx8="http://schemas.microsoft.com/office/drawing/2016/5/14/chartex" xmlns:mc="http://schemas.openxmlformats.org/markup-compatibility/2006" xmlns:aink="http://schemas.microsoft.com/office/drawing/2016/ink" xmlns:am3d="http://schemas.microsoft.com/office/drawing/2017/model3d" xmlns:o="urn:schemas-microsoft-com:office:office" xmlns:oel="http://schemas.microsoft.com/office/2019/extlst" xmlns:r="http://schemas.openxmlformats.org/officeDocument/2006/relationships" xmlns:m="http://schemas.openxmlformats.org/officeDocument/2006/math" xmlns:v="urn:schemas-microsoft-com:vml" xmlns:wp14="http://schemas.microsoft.com/office/word/2010/wordprocessingDrawing" xmlns:wp="http://schemas.openxmlformats.org/drawingml/2006/wordprocessingDrawing" xmlns:w10="urn:schemas-microsoft-com:office:word" xmlns:w="http://schemas.openxmlformats.org/wordprocessingml/2006/main" xmlns:w14="http://schemas.microsoft.com/office/word/2010/wordml" xmlns:w15="http://schemas.microsoft.com/office/word/2012/wordml" xmlns:w16cex="http://schemas.microsoft.com/office/word/2018/wordml/cex" xmlns:w16cid="http://schemas.microsoft.com/office/word/2016/wordml/cid" xmlns:w16="http://schemas.microsoft.com/office/word/2018/wordml" xmlns:w16sdtdh="http://schemas.microsoft.com/office/word/2020/wordml/sdtdatahash" xmlns:w16se="http://schemas.microsoft.com/office/word/2015/wordml/symex" xmlns:wpg="http://schemas.microsoft.com/office/word/2010/wordprocessingGroup" xmlns:wpi="http://schemas.microsoft.com/office/word/2010/wordprocessingInk" xmlns:wne="http://schemas.microsoft.com/office/word/2006/wordml" xmlns:wps="http://schemas.microsoft.com/office/word/2010/wordprocessingShape" mc:Ignorable="w14 w15 w16se w16cid w16 w16cex w16sdtdh wp14">
+<w:ftr xmlns:wpc="http://schemas.microsoft.com/office/word/2010/wordprocessingCanvas" xmlns:cx="http://schemas.microsoft.com/office/drawing/2014/chartex" xmlns:cx1="http://schemas.microsoft.com/office/drawing/2015/9/8/chartex" xmlns:cx2="http://schemas.microsoft.com/office/drawing/2015/10/21/chartex" xmlns:cx3="http://schemas.microsoft.com/office/drawing/2016/5/9/chartex" xmlns:cx4="http://schemas.microsoft.com/office/drawing/2016/5/10/chartex" xmlns:cx5="http://schemas.microsoft.com/office/drawing/2016/5/11/chartex" xmlns:cx6="http://schemas.microsoft.com/office/drawing/2016/5/12/chartex" xmlns:cx7="http://schemas.microsoft.com/office/drawing/2016/5/13/chartex" xmlns:cx8="http://schemas.microsoft.com/office/drawing/2016/5/14/chartex" xmlns:mc="http://schemas.openxmlformats.org/markup-compatibility/2006" xmlns:aink="http://schemas.microsoft.com/office/drawing/2016/ink" xmlns:am3d="http://schemas.microsoft.com/office/drawing/2017/model3d" xmlns:o="urn:schemas-microsoft-com:office:office" xmlns:oel="http://schemas.microsoft.com/office/2019/extlst" xmlns:r="http://schemas.openxmlformats.org/officeDocument/2006/relationships" xmlns:m="http://schemas.openxmlformats.org/officeDocument/2006/math" xmlns:v="urn:schemas-microsoft-com:vml" xmlns:wp14="http://schemas.microsoft.com/office/word/2010/wordprocessingDrawing" xmlns:wp="http://schemas.openxmlformats.org/drawingml/2006/wordprocessingDrawing" xmlns:w10="urn:schemas-microsoft-com:office:word" xmlns:w="http://schemas.openxmlformats.org/wordprocessingml/2006/main" xmlns:w14="http://schemas.microsoft.com/office/word/2010/wordml" xmlns:w15="http://schemas.microsoft.com/office/word/2012/wordml" xmlns:w16cex="http://schemas.microsoft.com/office/word/2018/wordml/cex" xmlns:w16cid="http://schemas.microsoft.com/office/word/2016/wordml/cid" xmlns:w16="http://schemas.microsoft.com/office/word/2018/wordml" xmlns:w16du="http://schemas.microsoft.com/office/word/2023/wordml/word16du" xmlns:w16sdtdh="http://schemas.microsoft.com/office/word/2020/wordml/sdtdatahash" xmlns:w16se="http://schemas.microsoft.com/office/word/2015/wordml/symex" xmlns:wpg="http://schemas.microsoft.com/office/word/2010/wordprocessingGroup" xmlns:wpi="http://schemas.microsoft.com/office/word/2010/wordprocessingInk" xmlns:wne="http://schemas.microsoft.com/office/word/2006/wordml" xmlns:wps="http://schemas.microsoft.com/office/word/2010/wordprocessingShape" mc:Ignorable="w14 w15 w16se w16cid w16 w16cex w16sdtdh w16du wp14">
   <w:p>
     <w:pPr>
       <w:pStyle w:val="En-tte"/>
@@ -11441,7 +11327,7 @@
             </mc:Choice>
             <mc:Fallback>
               <w:pict>
-                <v:rect w14:anchorId="379E146F" id="Rectangle 40" o:spid="_x0000_s1026" style="position:absolute;left:0;text-align:left;margin-left:0;margin-top:0;width:44.55pt;height:15.1pt;rotation:180;flip:x;z-index:251661312;visibility:visible;mso-wrap-style:square;mso-width-percent:0;mso-height-percent:0;mso-wrap-distance-left:9pt;mso-wrap-distance-top:0;mso-wrap-distance-right:9pt;mso-wrap-distance-bottom:0;mso-position-horizontal:center;mso-position-horizontal-relative:right-margin-area;mso-position-vertical:center;mso-position-vertical-relative:bottom-margin-area;mso-width-percent:0;mso-height-percent:0;mso-width-relative:page;mso-height-relative:bottom-margin-area;v-text-anchor:top" o:gfxdata="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" filled="f" fillcolor="#c0504d" stroked="f" strokecolor="#5c83b4" strokeweight="2.25pt">
+                <v:rect w14:anchorId="379E146F" id="Rectangle 40" o:spid="_x0000_s1026" style="position:absolute;left:0;text-align:left;margin-left:0;margin-top:0;width:44.55pt;height:15.1pt;rotation:180;flip:x;z-index:251661312;visibility:visible;mso-wrap-style:square;mso-width-percent:0;mso-height-percent:0;mso-wrap-distance-left:9pt;mso-wrap-distance-top:0;mso-wrap-distance-right:9pt;mso-wrap-distance-bottom:0;mso-position-horizontal:center;mso-position-horizontal-relative:right-margin-area;mso-position-vertical:center;mso-position-vertical-relative:bottom-margin-area;mso-width-percent:0;mso-height-percent:0;mso-width-relative:page;mso-height-relative:bottom-margin-area;v-text-anchor:top" o:gfxdata="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" filled="f" fillcolor="#c0504d" stroked="f" strokecolor="#5c83b4" strokeweight="2.25pt">
                   <v:textbox inset=",0,,0">
                     <w:txbxContent>
                       <w:p>
@@ -11486,7 +11372,7 @@
 </file>
 
 <file path=word/footer2.xml><?xml version="1.0" encoding="utf-8"?>
-<w:ftr xmlns:wpc="http://schemas.microsoft.com/office/word/2010/wordprocessingCanvas" xmlns:cx="http://schemas.microsoft.com/office/drawing/2014/chartex" xmlns:cx1="http://schemas.microsoft.com/office/drawing/2015/9/8/chartex" xmlns:cx2="http://schemas.microsoft.com/office/drawing/2015/10/21/chartex" xmlns:cx3="http://schemas.microsoft.com/office/drawing/2016/5/9/chartex" xmlns:cx4="http://schemas.microsoft.com/office/drawing/2016/5/10/chartex" xmlns:cx5="http://schemas.microsoft.com/office/drawing/2016/5/11/chartex" xmlns:cx6="http://schemas.microsoft.com/office/drawing/2016/5/12/chartex" xmlns:cx7="http://schemas.microsoft.com/office/drawing/2016/5/13/chartex" xmlns:cx8="http://schemas.microsoft.com/office/drawing/2016/5/14/chartex" xmlns:mc="http://schemas.openxmlformats.org/markup-compatibility/2006" xmlns:aink="http://schemas.microsoft.com/office/drawing/2016/ink" xmlns:am3d="http://schemas.microsoft.com/office/drawing/2017/model3d" xmlns:o="urn:schemas-microsoft-com:office:office" xmlns:oel="http://schemas.microsoft.com/office/2019/extlst" xmlns:r="http://schemas.openxmlformats.org/officeDocument/2006/relationships" xmlns:m="http://schemas.openxmlformats.org/officeDocument/2006/math" xmlns:v="urn:schemas-microsoft-com:vml" xmlns:wp14="http://schemas.microsoft.com/office/word/2010/wordprocessingDrawing" xmlns:wp="http://schemas.openxmlformats.org/drawingml/2006/wordprocessingDrawing" xmlns:w10="urn:schemas-microsoft-com:office:word" xmlns:w="http://schemas.openxmlformats.org/wordprocessingml/2006/main" xmlns:w14="http://schemas.microsoft.com/office/word/2010/wordml" xmlns:w15="http://schemas.microsoft.com/office/word/2012/wordml" xmlns:w16cex="http://schemas.microsoft.com/office/word/2018/wordml/cex" xmlns:w16cid="http://schemas.microsoft.com/office/word/2016/wordml/cid" xmlns:w16="http://schemas.microsoft.com/office/word/2018/wordml" xmlns:w16sdtdh="http://schemas.microsoft.com/office/word/2020/wordml/sdtdatahash" xmlns:w16se="http://schemas.microsoft.com/office/word/2015/wordml/symex" xmlns:wpg="http://schemas.microsoft.com/office/word/2010/wordprocessingGroup" xmlns:wpi="http://schemas.microsoft.com/office/word/2010/wordprocessingInk" xmlns:wne="http://schemas.microsoft.com/office/word/2006/wordml" xmlns:wps="http://schemas.microsoft.com/office/word/2010/wordprocessingShape" mc:Ignorable="w14 w15 w16se w16cid w16 w16cex w16sdtdh wp14">
+<w:ftr xmlns:wpc="http://schemas.microsoft.com/office/word/2010/wordprocessingCanvas" xmlns:cx="http://schemas.microsoft.com/office/drawing/2014/chartex" xmlns:cx1="http://schemas.microsoft.com/office/drawing/2015/9/8/chartex" xmlns:cx2="http://schemas.microsoft.com/office/drawing/2015/10/21/chartex" xmlns:cx3="http://schemas.microsoft.com/office/drawing/2016/5/9/chartex" xmlns:cx4="http://schemas.microsoft.com/office/drawing/2016/5/10/chartex" xmlns:cx5="http://schemas.microsoft.com/office/drawing/2016/5/11/chartex" xmlns:cx6="http://schemas.microsoft.com/office/drawing/2016/5/12/chartex" xmlns:cx7="http://schemas.microsoft.com/office/drawing/2016/5/13/chartex" xmlns:cx8="http://schemas.microsoft.com/office/drawing/2016/5/14/chartex" xmlns:mc="http://schemas.openxmlformats.org/markup-compatibility/2006" xmlns:aink="http://schemas.microsoft.com/office/drawing/2016/ink" xmlns:am3d="http://schemas.microsoft.com/office/drawing/2017/model3d" xmlns:o="urn:schemas-microsoft-com:office:office" xmlns:oel="http://schemas.microsoft.com/office/2019/extlst" xmlns:r="http://schemas.openxmlformats.org/officeDocument/2006/relationships" xmlns:m="http://schemas.openxmlformats.org/officeDocument/2006/math" xmlns:v="urn:schemas-microsoft-com:vml" xmlns:wp14="http://schemas.microsoft.com/office/word/2010/wordprocessingDrawing" xmlns:wp="http://schemas.openxmlformats.org/drawingml/2006/wordprocessingDrawing" xmlns:w10="urn:schemas-microsoft-com:office:word" xmlns:w="http://schemas.openxmlformats.org/wordprocessingml/2006/main" xmlns:w14="http://schemas.microsoft.com/office/word/2010/wordml" xmlns:w15="http://schemas.microsoft.com/office/word/2012/wordml" xmlns:w16cex="http://schemas.microsoft.com/office/word/2018/wordml/cex" xmlns:w16cid="http://schemas.microsoft.com/office/word/2016/wordml/cid" xmlns:w16="http://schemas.microsoft.com/office/word/2018/wordml" xmlns:w16du="http://schemas.microsoft.com/office/word/2023/wordml/word16du" xmlns:w16sdtdh="http://schemas.microsoft.com/office/word/2020/wordml/sdtdatahash" xmlns:w16se="http://schemas.microsoft.com/office/word/2015/wordml/symex" xmlns:wpg="http://schemas.microsoft.com/office/word/2010/wordprocessingGroup" xmlns:wpi="http://schemas.microsoft.com/office/word/2010/wordprocessingInk" xmlns:wne="http://schemas.microsoft.com/office/word/2006/wordml" xmlns:wps="http://schemas.microsoft.com/office/word/2010/wordprocessingShape" mc:Ignorable="w14 w15 w16se w16cid w16 w16cex w16sdtdh w16du wp14">
   <w:p>
     <w:pPr>
       <w:pStyle w:val="En-tte"/>
@@ -11623,7 +11509,7 @@
             </mc:Choice>
             <mc:Fallback>
               <w:pict>
-                <v:rect w14:anchorId="5D9E9625" id="Rectangle 1" o:spid="_x0000_s1027" style="position:absolute;left:0;text-align:left;margin-left:0;margin-top:0;width:44.55pt;height:15.1pt;rotation:180;flip:x;z-index:251659264;visibility:visible;mso-wrap-style:square;mso-width-percent:0;mso-height-percent:0;mso-wrap-distance-left:9pt;mso-wrap-distance-top:0;mso-wrap-distance-right:9pt;mso-wrap-distance-bottom:0;mso-position-horizontal:center;mso-position-horizontal-relative:right-margin-area;mso-position-vertical:center;mso-position-vertical-relative:bottom-margin-area;mso-width-percent:0;mso-height-percent:0;mso-width-relative:page;mso-height-relative:bottom-margin-area;v-text-anchor:top" o:gfxdata="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" filled="f" fillcolor="#c0504d" stroked="f" strokecolor="#5c83b4" strokeweight="2.25pt">
+                <v:rect w14:anchorId="5D9E9625" id="Rectangle 1" o:spid="_x0000_s1027" style="position:absolute;left:0;text-align:left;margin-left:0;margin-top:0;width:44.55pt;height:15.1pt;rotation:180;flip:x;z-index:251659264;visibility:visible;mso-wrap-style:square;mso-width-percent:0;mso-height-percent:0;mso-wrap-distance-left:9pt;mso-wrap-distance-top:0;mso-wrap-distance-right:9pt;mso-wrap-distance-bottom:0;mso-position-horizontal:center;mso-position-horizontal-relative:right-margin-area;mso-position-vertical:center;mso-position-vertical-relative:bottom-margin-area;mso-width-percent:0;mso-height-percent:0;mso-width-relative:page;mso-height-relative:bottom-margin-area;v-text-anchor:top" o:gfxdata="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" filled="f" fillcolor="#c0504d" stroked="f" strokecolor="#5c83b4" strokeweight="2.25pt">
                   <v:textbox inset=",0,,0">
                     <w:txbxContent>
                       <w:p>
@@ -11668,7 +11554,7 @@
 </file>
 
 <file path=word/footnotes.xml><?xml version="1.0" encoding="utf-8"?>
-<w:footnotes xmlns:wpc="http://schemas.microsoft.com/office/word/2010/wordprocessingCanvas" xmlns:cx="http://schemas.microsoft.com/office/drawing/2014/chartex" xmlns:cx1="http://schemas.microsoft.com/office/drawing/2015/9/8/chartex" xmlns:cx2="http://schemas.microsoft.com/office/drawing/2015/10/21/chartex" xmlns:cx3="http://schemas.microsoft.com/office/drawing/2016/5/9/chartex" xmlns:cx4="http://schemas.microsoft.com/office/drawing/2016/5/10/chartex" xmlns:cx5="http://schemas.microsoft.com/office/drawing/2016/5/11/chartex" xmlns:cx6="http://schemas.microsoft.com/office/drawing/2016/5/12/chartex" xmlns:cx7="http://schemas.microsoft.com/office/drawing/2016/5/13/chartex" xmlns:cx8="http://schemas.microsoft.com/office/drawing/2016/5/14/chartex" xmlns:mc="http://schemas.openxmlformats.org/markup-compatibility/2006" xmlns:aink="http://schemas.microsoft.com/office/drawing/2016/ink" xmlns:am3d="http://schemas.microsoft.com/office/drawing/2017/model3d" xmlns:o="urn:schemas-microsoft-com:office:office" xmlns:oel="http://schemas.microsoft.com/office/2019/extlst" xmlns:r="http://schemas.openxmlformats.org/officeDocument/2006/relationships" xmlns:m="http://schemas.openxmlformats.org/officeDocument/2006/math" xmlns:v="urn:schemas-microsoft-com:vml" xmlns:wp14="http://schemas.microsoft.com/office/word/2010/wordprocessingDrawing" xmlns:wp="http://schemas.openxmlformats.org/drawingml/2006/wordprocessingDrawing" xmlns:w10="urn:schemas-microsoft-com:office:word" xmlns:w="http://schemas.openxmlformats.org/wordprocessingml/2006/main" xmlns:w14="http://schemas.microsoft.com/office/word/2010/wordml" xmlns:w15="http://schemas.microsoft.com/office/word/2012/wordml" xmlns:w16cex="http://schemas.microsoft.com/office/word/2018/wordml/cex" xmlns:w16cid="http://schemas.microsoft.com/office/word/2016/wordml/cid" xmlns:w16="http://schemas.microsoft.com/office/word/2018/wordml" xmlns:w16sdtdh="http://schemas.microsoft.com/office/word/2020/wordml/sdtdatahash" xmlns:w16se="http://schemas.microsoft.com/office/word/2015/wordml/symex" xmlns:wpg="http://schemas.microsoft.com/office/word/2010/wordprocessingGroup" xmlns:wpi="http://schemas.microsoft.com/office/word/2010/wordprocessingInk" xmlns:wne="http://schemas.microsoft.com/office/word/2006/wordml" xmlns:wps="http://schemas.microsoft.com/office/word/2010/wordprocessingShape" mc:Ignorable="w14 w15 w16se w16cid w16 w16cex w16sdtdh wp14">
+<w:footnotes xmlns:wpc="http://schemas.microsoft.com/office/word/2010/wordprocessingCanvas" xmlns:cx="http://schemas.microsoft.com/office/drawing/2014/chartex" xmlns:cx1="http://schemas.microsoft.com/office/drawing/2015/9/8/chartex" xmlns:cx2="http://schemas.microsoft.com/office/drawing/2015/10/21/chartex" xmlns:cx3="http://schemas.microsoft.com/office/drawing/2016/5/9/chartex" xmlns:cx4="http://schemas.microsoft.com/office/drawing/2016/5/10/chartex" xmlns:cx5="http://schemas.microsoft.com/office/drawing/2016/5/11/chartex" xmlns:cx6="http://schemas.microsoft.com/office/drawing/2016/5/12/chartex" xmlns:cx7="http://schemas.microsoft.com/office/drawing/2016/5/13/chartex" xmlns:cx8="http://schemas.microsoft.com/office/drawing/2016/5/14/chartex" xmlns:mc="http://schemas.openxmlformats.org/markup-compatibility/2006" xmlns:aink="http://schemas.microsoft.com/office/drawing/2016/ink" xmlns:am3d="http://schemas.microsoft.com/office/drawing/2017/model3d" xmlns:o="urn:schemas-microsoft-com:office:office" xmlns:oel="http://schemas.microsoft.com/office/2019/extlst" xmlns:r="http://schemas.openxmlformats.org/officeDocument/2006/relationships" xmlns:m="http://schemas.openxmlformats.org/officeDocument/2006/math" xmlns:v="urn:schemas-microsoft-com:vml" xmlns:wp14="http://schemas.microsoft.com/office/word/2010/wordprocessingDrawing" xmlns:wp="http://schemas.openxmlformats.org/drawingml/2006/wordprocessingDrawing" xmlns:w10="urn:schemas-microsoft-com:office:word" xmlns:w="http://schemas.openxmlformats.org/wordprocessingml/2006/main" xmlns:w14="http://schemas.microsoft.com/office/word/2010/wordml" xmlns:w15="http://schemas.microsoft.com/office/word/2012/wordml" xmlns:w16cex="http://schemas.microsoft.com/office/word/2018/wordml/cex" xmlns:w16cid="http://schemas.microsoft.com/office/word/2016/wordml/cid" xmlns:w16="http://schemas.microsoft.com/office/word/2018/wordml" xmlns:w16du="http://schemas.microsoft.com/office/word/2023/wordml/word16du" xmlns:w16sdtdh="http://schemas.microsoft.com/office/word/2020/wordml/sdtdatahash" xmlns:w16se="http://schemas.microsoft.com/office/word/2015/wordml/symex" xmlns:wpg="http://schemas.microsoft.com/office/word/2010/wordprocessingGroup" xmlns:wpi="http://schemas.microsoft.com/office/word/2010/wordprocessingInk" xmlns:wne="http://schemas.microsoft.com/office/word/2006/wordml" xmlns:wps="http://schemas.microsoft.com/office/word/2010/wordprocessingShape" mc:Ignorable="w14 w15 w16se w16cid w16 w16cex w16sdtdh w16du wp14">
   <w:footnote w:type="separator" w:id="-1">
     <w:p>
       <w:pPr>
@@ -11693,7 +11579,7 @@
 </file>
 
 <file path=word/numbering.xml><?xml version="1.0" encoding="utf-8"?>
-<w:numbering xmlns:wpc="http://schemas.microsoft.com/office/word/2010/wordprocessingCanvas" xmlns:cx="http://schemas.microsoft.com/office/drawing/2014/chartex" xmlns:cx1="http://schemas.microsoft.com/office/drawing/2015/9/8/chartex" xmlns:cx2="http://schemas.microsoft.com/office/drawing/2015/10/21/chartex" xmlns:cx3="http://schemas.microsoft.com/office/drawing/2016/5/9/chartex" xmlns:cx4="http://schemas.microsoft.com/office/drawing/2016/5/10/chartex" xmlns:cx5="http://schemas.microsoft.com/office/drawing/2016/5/11/chartex" xmlns:cx6="http://schemas.microsoft.com/office/drawing/2016/5/12/chartex" xmlns:cx7="http://schemas.microsoft.com/office/drawing/2016/5/13/chartex" xmlns:cx8="http://schemas.microsoft.com/office/drawing/2016/5/14/chartex" xmlns:mc="http://schemas.openxmlformats.org/markup-compatibility/2006" xmlns:aink="http://schemas.microsoft.com/office/drawing/2016/ink" xmlns:am3d="http://schemas.microsoft.com/office/drawing/2017/model3d" xmlns:o="urn:schemas-microsoft-com:office:office" xmlns:oel="http://schemas.microsoft.com/office/2019/extlst" xmlns:r="http://schemas.openxmlformats.org/officeDocument/2006/relationships" xmlns:m="http://schemas.openxmlformats.org/officeDocument/2006/math" xmlns:v="urn:schemas-microsoft-com:vml" xmlns:wp14="http://schemas.microsoft.com/office/word/2010/wordprocessingDrawing" xmlns:wp="http://schemas.openxmlformats.org/drawingml/2006/wordprocessingDrawing" xmlns:w10="urn:schemas-microsoft-com:office:word" xmlns:w="http://schemas.openxmlformats.org/wordprocessingml/2006/main" xmlns:w14="http://schemas.microsoft.com/office/word/2010/wordml" xmlns:w15="http://schemas.microsoft.com/office/word/2012/wordml" xmlns:w16cex="http://schemas.microsoft.com/office/word/2018/wordml/cex" xmlns:w16cid="http://schemas.microsoft.com/office/word/2016/wordml/cid" xmlns:w16="http://schemas.microsoft.com/office/word/2018/wordml" xmlns:w16sdtdh="http://schemas.microsoft.com/office/word/2020/wordml/sdtdatahash" xmlns:w16se="http://schemas.microsoft.com/office/word/2015/wordml/symex" xmlns:wpg="http://schemas.microsoft.com/office/word/2010/wordprocessingGroup" xmlns:wpi="http://schemas.microsoft.com/office/word/2010/wordprocessingInk" xmlns:wne="http://schemas.microsoft.com/office/word/2006/wordml" xmlns:wps="http://schemas.microsoft.com/office/word/2010/wordprocessingShape" mc:Ignorable="w14 w15 w16se w16cid w16 w16cex w16sdtdh wp14">
+<w:numbering xmlns:wpc="http://schemas.microsoft.com/office/word/2010/wordprocessingCanvas" xmlns:cx="http://schemas.microsoft.com/office/drawing/2014/chartex" xmlns:cx1="http://schemas.microsoft.com/office/drawing/2015/9/8/chartex" xmlns:cx2="http://schemas.microsoft.com/office/drawing/2015/10/21/chartex" xmlns:cx3="http://schemas.microsoft.com/office/drawing/2016/5/9/chartex" xmlns:cx4="http://schemas.microsoft.com/office/drawing/2016/5/10/chartex" xmlns:cx5="http://schemas.microsoft.com/office/drawing/2016/5/11/chartex" xmlns:cx6="http://schemas.microsoft.com/office/drawing/2016/5/12/chartex" xmlns:cx7="http://schemas.microsoft.com/office/drawing/2016/5/13/chartex" xmlns:cx8="http://schemas.microsoft.com/office/drawing/2016/5/14/chartex" xmlns:mc="http://schemas.openxmlformats.org/markup-compatibility/2006" xmlns:aink="http://schemas.microsoft.com/office/drawing/2016/ink" xmlns:am3d="http://schemas.microsoft.com/office/drawing/2017/model3d" xmlns:o="urn:schemas-microsoft-com:office:office" xmlns:oel="http://schemas.microsoft.com/office/2019/extlst" xmlns:r="http://schemas.openxmlformats.org/officeDocument/2006/relationships" xmlns:m="http://schemas.openxmlformats.org/officeDocument/2006/math" xmlns:v="urn:schemas-microsoft-com:vml" xmlns:wp14="http://schemas.microsoft.com/office/word/2010/wordprocessingDrawing" xmlns:wp="http://schemas.openxmlformats.org/drawingml/2006/wordprocessingDrawing" xmlns:w10="urn:schemas-microsoft-com:office:word" xmlns:w="http://schemas.openxmlformats.org/wordprocessingml/2006/main" xmlns:w14="http://schemas.microsoft.com/office/word/2010/wordml" xmlns:w15="http://schemas.microsoft.com/office/word/2012/wordml" xmlns:w16cex="http://schemas.microsoft.com/office/word/2018/wordml/cex" xmlns:w16cid="http://schemas.microsoft.com/office/word/2016/wordml/cid" xmlns:w16="http://schemas.microsoft.com/office/word/2018/wordml" xmlns:w16du="http://schemas.microsoft.com/office/word/2023/wordml/word16du" xmlns:w16sdtdh="http://schemas.microsoft.com/office/word/2020/wordml/sdtdatahash" xmlns:w16se="http://schemas.microsoft.com/office/word/2015/wordml/symex" xmlns:wpg="http://schemas.microsoft.com/office/word/2010/wordprocessingGroup" xmlns:wpi="http://schemas.microsoft.com/office/word/2010/wordprocessingInk" xmlns:wne="http://schemas.microsoft.com/office/word/2006/wordml" xmlns:wps="http://schemas.microsoft.com/office/word/2010/wordprocessingShape" mc:Ignorable="w14 w15 w16se w16cid w16 w16cex w16sdtdh w16du wp14">
   <w:abstractNum w:abstractNumId="0" w15:restartNumberingAfterBreak="0">
     <w:nsid w:val="134612E3"/>
     <w:multiLevelType w:val="hybridMultilevel"/>
@@ -14184,7 +14070,7 @@
 </file>
 
 <file path=word/styles.xml><?xml version="1.0" encoding="utf-8"?>
-<w:styles xmlns:mc="http://schemas.openxmlformats.org/markup-compatibility/2006" xmlns:r="http://schemas.openxmlformats.org/officeDocument/2006/relationships" xmlns:w="http://schemas.openxmlformats.org/wordprocessingml/2006/main" xmlns:w14="http://schemas.microsoft.com/office/word/2010/wordml" xmlns:w15="http://schemas.microsoft.com/office/word/2012/wordml" xmlns:w16cex="http://schemas.microsoft.com/office/word/2018/wordml/cex" xmlns:w16cid="http://schemas.microsoft.com/office/word/2016/wordml/cid" xmlns:w16="http://schemas.microsoft.com/office/word/2018/wordml" xmlns:w16sdtdh="http://schemas.microsoft.com/office/word/2020/wordml/sdtdatahash" xmlns:w16se="http://schemas.microsoft.com/office/word/2015/wordml/symex" mc:Ignorable="w14 w15 w16se w16cid w16 w16cex w16sdtdh">
+<w:styles xmlns:mc="http://schemas.openxmlformats.org/markup-compatibility/2006" xmlns:r="http://schemas.openxmlformats.org/officeDocument/2006/relationships" xmlns:w="http://schemas.openxmlformats.org/wordprocessingml/2006/main" xmlns:w14="http://schemas.microsoft.com/office/word/2010/wordml" xmlns:w15="http://schemas.microsoft.com/office/word/2012/wordml" xmlns:w16cex="http://schemas.microsoft.com/office/word/2018/wordml/cex" xmlns:w16cid="http://schemas.microsoft.com/office/word/2016/wordml/cid" xmlns:w16="http://schemas.microsoft.com/office/word/2018/wordml" xmlns:w16du="http://schemas.microsoft.com/office/word/2023/wordml/word16du" xmlns:w16sdtdh="http://schemas.microsoft.com/office/word/2020/wordml/sdtdatahash" xmlns:w16se="http://schemas.microsoft.com/office/word/2015/wordml/symex" mc:Ignorable="w14 w15 w16se w16cid w16 w16cex w16sdtdh w16du">
   <w:docDefaults>
     <w:rPrDefault>
       <w:rPr>

</xml_diff>